<commit_message>
docs(benchmark): regenerate verification report for the full-road-network run
The road graph now covers every walkable+drivable street (Kahramanmaras
39285 -> 49666 edges, Hatay 32963 -> 40950) and the 8000-segment map cap
is gone, so the closure sample and every route was recomputed. Report,
PDF and DOCX now carry the tam-yol-kontrol numbers instead of the older
drive-only run:

- naive agent failed to reach its target in 2/10 assignments (was 1/10)
- across the 8 it did reach: 2 ties, 6 wins, +39.7 min / +9891 m total
  (was +7.6 min / +1903 m)
- largest single gain 21.9 min / 5468 m (Hatay, 13 dead-end discoveries)

Also adds a methodology note explaining the coverage change, and checks
in the HTML source alongside the PDF/DOCX so the report is reproducible
from the repo.

Co-Authored-By: Claude Opus 5 <noreply@anthropic.com>
</commit_message>
<xml_diff>
--- a/QuakeMindBackend/benchmark/reports/quakemind_dogrulama_raporu.docx
+++ b/QuakeMindBackend/benchmark/reports/quakemind_dogrulama_raporu.docx
@@ -129,7 +129,7 @@
                 <w:b/>
                 <w:sz w:val="18"/>
               </w:rPr>
-              <w:t>Koşu Kimlikleri</w:t>
+              <w:t>Koşu Kimliği</w:t>
             </w:r>
           </w:p>
         </w:tc>
@@ -201,7 +201,7 @@
               <w:rPr>
                 <w:sz w:val="19"/>
               </w:rPr>
-              <w:t>rich-kahramanmaras-final · rich-hatay-final</w:t>
+              <w:t>tam-yol-kontrol</w:t>
             </w:r>
           </w:p>
         </w:tc>
@@ -412,7 +412,7 @@
               <w:rPr>
                 <w:sz w:val="19"/>
               </w:rPr>
-              <w:t>1 / 10</w:t>
+              <w:t>2 / 10</w:t>
             </w:r>
           </w:p>
         </w:tc>
@@ -442,7 +442,7 @@
               <w:rPr>
                 <w:sz w:val="19"/>
               </w:rPr>
-              <w:t>Ulaşabildiği 9 Vakada Toplam Kazanç</w:t>
+              <w:t>Ulaşabildiği 8 Vakada Toplam Kazanç</w:t>
             </w:r>
           </w:p>
         </w:tc>
@@ -456,7 +456,7 @@
               <w:rPr>
                 <w:sz w:val="19"/>
               </w:rPr>
-              <w:t>7,6 dk</w:t>
+              <w:t>39,7 dk</w:t>
             </w:r>
           </w:p>
         </w:tc>
@@ -470,7 +470,7 @@
               <w:rPr>
                 <w:sz w:val="19"/>
               </w:rPr>
-              <w:t>hiçbir vakada negatif — eşit veya daha iyi, ~1,9 km toplam</w:t>
+              <w:t>hiçbir vakada negatif — eşit veya daha iyi, ~9,9 km toplam</w:t>
             </w:r>
           </w:p>
         </w:tc>
@@ -605,6 +605,32 @@
           <w:sz w:val="21"/>
         </w:rPr>
         <w:t>İlk karşılaştırma turunda naif ajanın bazı vakalarda bizim motordan daha kısa bir mesafe bulduğu (matematiksel olarak imkânsız olması gereken bir durum) fark edildi. Kök sebep izlendiğinde, rota motorunun bazı OSM yol kenarlarının geometrisini ters yönde okuduğu ve ardışık kenarları birleştirirken gerçekte var olmayan sıçramalar eklediği ortaya çıktı — bu, yalnızca bu karşılaştırmayı değil, sistemdeki tüm gerçek rota mesafelerini sistematik olarak şişiriyordu. Düzeltme calculate_route içinde uygulandı ve her iki şehirde tüm atamalar yeniden çalıştırıldı; bu rapordaki sayılar düzeltme sonrası elde edilmiştir.</w:t>
+      </w:r>
+    </w:p>
+    <w:p>
+      <w:pPr>
+        <w:spacing w:after="40"/>
+      </w:pPr>
+      <w:r>
+        <w:rPr>
+          <w:b/>
+          <w:color w:val="C04A2C"/>
+          <w:sz w:val="21"/>
+        </w:rPr>
+        <w:t>Yol ağı kapsamının genişletilmesi:</w:t>
+      </w:r>
+    </w:p>
+    <w:p>
+      <w:pPr>
+        <w:spacing w:after="160"/>
+      </w:pPr>
+      <w:r>
+        <w:rPr>
+          <w:b w:val="0"/>
+          <w:color w:val="6D6153"/>
+          <w:sz w:val="21"/>
+        </w:rPr>
+        <w:t>İlk koşularda yol grafiği yalnızca araç geçişine açık yolları içeriyordu ve haritaya gönderilen segment sayısı 8.000 ile sınırlıydı; bu nedenle şehir ağının yalnızca bir bölümü analiz ediliyor ve görselleştiriliyordu. Bu koşuda yol ağı yaya ve araç geçişine açık tüm sokakları kapsayacak şekilde genişletildi (Kahramanmaraş 39.285 → 49.666 kenar, Hatay 32.963 → 40.950) ve segment sınırı kaldırıldı. Arama-kurtarma ekipleri sahada hem araçla hem yaya ilerlediği için bu, senaryonun gerçekliğini de artırmaktadır. Bu rapordaki tüm sayılar bu genişletilmiş ağ üzerinde üretilmiştir.</w:t>
       </w:r>
     </w:p>
     <w:p>
@@ -939,7 +965,7 @@
           <w:color w:val="221D18"/>
           <w:sz w:val="19"/>
         </w:rPr>
-        <w:t>Kahramanmaraş: 18.004 düğüm / 441 kapalı segment · Hatay: 15.676 düğüm / 370 kapalı segment</w:t>
+        <w:t>Kahramanmaraş: 20.643 düğüm / 1.117 kapalı segment · Hatay: 18.060 düğüm / 460 kapalı segment</w:t>
       </w:r>
     </w:p>
     <w:p>
@@ -1063,7 +1089,7 @@
           <w:color w:val="221D18"/>
           <w:sz w:val="19"/>
         </w:rPr>
-        <w:t>Haritada 34 aktif işaretçi (20 SOS + 10 ekip + 4 enkaz), 1.821 yol segmenti çizgisi — tarayıcıda doğrulandı</w:t>
+        <w:t>Haritada 34 aktif işaretçi (20 SOS + 10 ekip + 4 enkaz) ve 90.616 yol segmenti (89.039 açık / 1.577 kapalı) — tarayıcıda doğrulandı</w:t>
       </w:r>
     </w:p>
     <w:p>
@@ -1125,7 +1151,7 @@
           <w:color w:val="221D18"/>
           <w:sz w:val="19"/>
         </w:rPr>
-        <w:t>10/10 rota isteği başarılı — 1.619 m ile 10.418 m arası gerçek yürüme/araç mesafeleri</w:t>
+        <w:t>10/10 rota isteği başarılı — 978 m ile 3.959 m arası gerçek yürüme/araç mesafeleri</w:t>
       </w:r>
     </w:p>
     <w:p>
@@ -1243,7 +1269,7 @@
           <w:color w:val="6D6153"/>
           <w:sz w:val="19"/>
         </w:rPr>
-        <w:t>37,5756° K, 36,9207° D · yarıçap 3 km · koşu rich-kahramanmaras-final</w:t>
+        <w:t>37,5756° K, 36,9207° D · yarıçap 3 km · koşu tam-yol-kontrol</w:t>
       </w:r>
     </w:p>
     <w:p>
@@ -1256,7 +1282,7 @@
           <w:color w:val="6D6153"/>
           <w:sz w:val="19"/>
         </w:rPr>
-        <w:t>Analiz alanı: 18.004 düğüm / 39.285 kenar gerçek OSM yol grafiği (yerel önbellek, Overpass'e gidilmedi). Kapanma oranı otomatik ayar sonrası: 500/1.000 segment (%50,0 tıkalı).</w:t>
+        <w:t>Analiz alanı: 20.643 düğüm / 49.666 kenar gerçek OSM yol grafiği — yaya ve araç geçişine açık tüm sokaklar dahil (yerel önbellek, Overpass'e gidilmedi). Kapanma oranı otomatik ayar sonrası: 1.117 / 49.666 segment (%2,2 tıkalı).</w:t>
       </w:r>
     </w:p>
     <w:tbl>
@@ -1769,7 +1795,7 @@
               <w:rPr>
                 <w:sz w:val="19"/>
               </w:rPr>
-              <w:t>1.398 m / 5,6 dk</w:t>
+              <w:t>1.354 m / 5,4 dk</w:t>
             </w:r>
           </w:p>
         </w:tc>
@@ -1783,7 +1809,7 @@
               <w:rPr>
                 <w:sz w:val="19"/>
               </w:rPr>
-              <w:t>1.398 m / 5,6 dk</w:t>
+              <w:t>Hedefe ulaşamadı</w:t>
             </w:r>
           </w:p>
         </w:tc>
@@ -1797,7 +1823,7 @@
               <w:rPr>
                 <w:sz w:val="19"/>
               </w:rPr>
-              <w:t>eşit</w:t>
+              <w:t>—</w:t>
             </w:r>
           </w:p>
         </w:tc>
@@ -1841,7 +1867,79 @@
               <w:rPr>
                 <w:sz w:val="19"/>
               </w:rPr>
-              <w:t>2.794 m / 11,2 dk</w:t>
+              <w:t>2.380 m / 9,5 dk</w:t>
+            </w:r>
+          </w:p>
+        </w:tc>
+        <w:tc>
+          <w:tcPr>
+            <w:tcW w:type="dxa" w:w="1949"/>
+          </w:tcPr>
+          <w:p>
+            <w:r/>
+            <w:r>
+              <w:rPr>
+                <w:sz w:val="19"/>
+              </w:rPr>
+              <w:t>2.380 m / 9,5 dk</w:t>
+            </w:r>
+          </w:p>
+        </w:tc>
+        <w:tc>
+          <w:tcPr>
+            <w:tcW w:type="dxa" w:w="1949"/>
+          </w:tcPr>
+          <w:p>
+            <w:r/>
+            <w:r>
+              <w:rPr>
+                <w:sz w:val="19"/>
+              </w:rPr>
+              <w:t>eşit</w:t>
+            </w:r>
+          </w:p>
+        </w:tc>
+      </w:tr>
+      <w:tr>
+        <w:tc>
+          <w:tcPr>
+            <w:tcW w:type="dxa" w:w="1949"/>
+          </w:tcPr>
+          <w:p>
+            <w:r/>
+            <w:r>
+              <w:rPr>
+                <w:sz w:val="19"/>
+              </w:rPr>
+              <w:t>rich-ekip-5 → rich-ihbar-5</w:t>
+            </w:r>
+          </w:p>
+        </w:tc>
+        <w:tc>
+          <w:tcPr>
+            <w:tcW w:type="dxa" w:w="1949"/>
+          </w:tcPr>
+          <w:p>
+            <w:r/>
+            <w:r>
+              <w:rPr>
+                <w:sz w:val="19"/>
+              </w:rPr>
+              <w:t>yaralı</w:t>
+            </w:r>
+          </w:p>
+        </w:tc>
+        <w:tc>
+          <w:tcPr>
+            <w:tcW w:type="dxa" w:w="1949"/>
+          </w:tcPr>
+          <w:p>
+            <w:r/>
+            <w:r>
+              <w:rPr>
+                <w:sz w:val="19"/>
+              </w:rPr>
+              <w:t>1.938 m / 7,8 dk</w:t>
             </w:r>
           </w:p>
         </w:tc>
@@ -1885,78 +1983,6 @@
               <w:rPr>
                 <w:sz w:val="19"/>
               </w:rPr>
-              <w:t>rich-ekip-5 → rich-ihbar-5</w:t>
-            </w:r>
-          </w:p>
-        </w:tc>
-        <w:tc>
-          <w:tcPr>
-            <w:tcW w:type="dxa" w:w="1949"/>
-          </w:tcPr>
-          <w:p>
-            <w:r/>
-            <w:r>
-              <w:rPr>
-                <w:sz w:val="19"/>
-              </w:rPr>
-              <w:t>yaralı</w:t>
-            </w:r>
-          </w:p>
-        </w:tc>
-        <w:tc>
-          <w:tcPr>
-            <w:tcW w:type="dxa" w:w="1949"/>
-          </w:tcPr>
-          <w:p>
-            <w:r/>
-            <w:r>
-              <w:rPr>
-                <w:sz w:val="19"/>
-              </w:rPr>
-              <w:t>1.534 m / 6,1 dk</w:t>
-            </w:r>
-          </w:p>
-        </w:tc>
-        <w:tc>
-          <w:tcPr>
-            <w:tcW w:type="dxa" w:w="1949"/>
-          </w:tcPr>
-          <w:p>
-            <w:r/>
-            <w:r>
-              <w:rPr>
-                <w:sz w:val="19"/>
-              </w:rPr>
-              <w:t>1.534 m / 6,1 dk</w:t>
-            </w:r>
-          </w:p>
-        </w:tc>
-        <w:tc>
-          <w:tcPr>
-            <w:tcW w:type="dxa" w:w="1949"/>
-          </w:tcPr>
-          <w:p>
-            <w:r/>
-            <w:r>
-              <w:rPr>
-                <w:sz w:val="19"/>
-              </w:rPr>
-              <w:t>eşit</w:t>
-            </w:r>
-          </w:p>
-        </w:tc>
-      </w:tr>
-      <w:tr>
-        <w:tc>
-          <w:tcPr>
-            <w:tcW w:type="dxa" w:w="1949"/>
-          </w:tcPr>
-          <w:p>
-            <w:r/>
-            <w:r>
-              <w:rPr>
-                <w:sz w:val="19"/>
-              </w:rPr>
               <w:t>rich-ekip-3 → rich-ihbar-6</w:t>
             </w:r>
           </w:p>
@@ -1985,7 +2011,7 @@
               <w:rPr>
                 <w:sz w:val="19"/>
               </w:rPr>
-              <w:t>2.839 m / 11,4 dk</w:t>
+              <w:t>2.262 m / 9,0 dk</w:t>
             </w:r>
           </w:p>
         </w:tc>
@@ -1999,7 +2025,7 @@
               <w:rPr>
                 <w:sz w:val="19"/>
               </w:rPr>
-              <w:t>2.925 m / 11,7 dk</w:t>
+              <w:t>3.970 m / 15,9 dk</w:t>
             </w:r>
           </w:p>
         </w:tc>
@@ -2013,7 +2039,7 @@
               <w:rPr>
                 <w:sz w:val="19"/>
               </w:rPr>
-              <w:t>+86 m / +0,3 dk</w:t>
+              <w:t>+1.709 m / +6,9 dk</w:t>
             </w:r>
           </w:p>
         </w:tc>
@@ -2057,7 +2083,7 @@
               <w:rPr>
                 <w:sz w:val="19"/>
               </w:rPr>
-              <w:t>1.077 m / 4,3 dk</w:t>
+              <w:t>978 m / 3,9 dk</w:t>
             </w:r>
           </w:p>
         </w:tc>
@@ -2071,7 +2097,7 @@
               <w:rPr>
                 <w:sz w:val="19"/>
               </w:rPr>
-              <w:t>1.204 m / 4,8 dk</w:t>
+              <w:t>978 m / 3,9 dk</w:t>
             </w:r>
           </w:p>
         </w:tc>
@@ -2085,7 +2111,7 @@
               <w:rPr>
                 <w:sz w:val="19"/>
               </w:rPr>
-              <w:t>+127 m / +0,5 dk</w:t>
+              <w:t>eşit</w:t>
             </w:r>
           </w:p>
         </w:tc>
@@ -2186,7 +2212,7 @@
               <w:rPr>
                 <w:sz w:val="19"/>
               </w:rPr>
-              <w:t>1 / 5 ekip</w:t>
+              <w:t>2 / 5 ekip</w:t>
             </w:r>
           </w:p>
         </w:tc>
@@ -2200,7 +2226,7 @@
               <w:rPr>
                 <w:sz w:val="19"/>
               </w:rPr>
-              <w:t>0,8 dk</w:t>
+              <w:t>6,9 dk</w:t>
             </w:r>
           </w:p>
         </w:tc>
@@ -2263,7 +2289,7 @@
           <w:color w:val="6D6153"/>
           <w:sz w:val="19"/>
         </w:rPr>
-        <w:t>36,1941° K, 36,1469° D · yarıçap 3 km · koşu rich-hatay-final</w:t>
+        <w:t>36,1941° K, 36,1469° D · yarıçap 3 km · koşu tam-yol-kontrol</w:t>
       </w:r>
     </w:p>
     <w:p>
@@ -2276,7 +2302,7 @@
           <w:color w:val="6D6153"/>
           <w:sz w:val="19"/>
         </w:rPr>
-        <w:t>Analiz alanı: 15.676 düğüm / 32.963 kenar gerçek OSM yol grafiği. Kapanma oranı otomatik ayar sonrası: 370/870 segment (%42,5 tıkalı).</w:t>
+        <w:t>Analiz alanı: 18.060 düğüm / 40.950 kenar gerçek OSM yol grafiği — yaya ve araç geçişine açık tüm sokaklar dahil. Kapanma oranı otomatik ayar sonrası: 460 / 40.950 segment (%1,1 tıkalı).</w:t>
       </w:r>
     </w:p>
     <w:tbl>
@@ -2789,7 +2815,7 @@
               <w:rPr>
                 <w:sz w:val="19"/>
               </w:rPr>
-              <w:t>2.465 m / 9,9 dk</w:t>
+              <w:t>2.407 m / 9,6 dk</w:t>
             </w:r>
           </w:p>
         </w:tc>
@@ -2803,7 +2829,7 @@
               <w:rPr>
                 <w:sz w:val="19"/>
               </w:rPr>
-              <w:t>2.592 m / 10,4 dk</w:t>
+              <w:t>2.916 m / 11,7 dk</w:t>
             </w:r>
           </w:p>
         </w:tc>
@@ -2817,7 +2843,7 @@
               <w:rPr>
                 <w:sz w:val="19"/>
               </w:rPr>
-              <w:t>+128 m / +0,5 dk</w:t>
+              <w:t>+509 m / +2,1 dk</w:t>
             </w:r>
           </w:p>
         </w:tc>
@@ -2875,7 +2901,7 @@
               <w:rPr>
                 <w:sz w:val="19"/>
               </w:rPr>
-              <w:t>1.397 m / 5,6 dk</w:t>
+              <w:t>1.802 m / 7,2 dk</w:t>
             </w:r>
           </w:p>
         </w:tc>
@@ -2889,7 +2915,7 @@
               <w:rPr>
                 <w:sz w:val="19"/>
               </w:rPr>
-              <w:t>eşit</w:t>
+              <w:t>+406 m / +1,6 dk</w:t>
             </w:r>
           </w:p>
         </w:tc>
@@ -2933,7 +2959,7 @@
               <w:rPr>
                 <w:sz w:val="19"/>
               </w:rPr>
-              <w:t>2.298 m / 9,2 dk</w:t>
+              <w:t>3.651 m / 14,6 dk</w:t>
             </w:r>
           </w:p>
         </w:tc>
@@ -2947,7 +2973,7 @@
               <w:rPr>
                 <w:sz w:val="19"/>
               </w:rPr>
-              <w:t>2.593 m / 10,4 dk</w:t>
+              <w:t>9.120 m / 36,5 dk</w:t>
             </w:r>
           </w:p>
         </w:tc>
@@ -2961,7 +2987,7 @@
               <w:rPr>
                 <w:sz w:val="19"/>
               </w:rPr>
-              <w:t>+295 m / +1,2 dk</w:t>
+              <w:t>+5.468 m / +21,9 dk</w:t>
             </w:r>
           </w:p>
         </w:tc>
@@ -3005,7 +3031,7 @@
               <w:rPr>
                 <w:sz w:val="19"/>
               </w:rPr>
-              <w:t>4.280 m / 17,1 dk</w:t>
+              <w:t>3.959 m / 15,8 dk</w:t>
             </w:r>
           </w:p>
         </w:tc>
@@ -3019,7 +3045,7 @@
               <w:rPr>
                 <w:sz w:val="19"/>
               </w:rPr>
-              <w:t>5.096 m / 20,4 dk</w:t>
+              <w:t>5.283 m / 21,1 dk</w:t>
             </w:r>
           </w:p>
         </w:tc>
@@ -3033,7 +3059,7 @@
               <w:rPr>
                 <w:sz w:val="19"/>
               </w:rPr>
-              <w:t>+816 m / +3,3 dk</w:t>
+              <w:t>+1.324 m / +5,3 dk</w:t>
             </w:r>
           </w:p>
         </w:tc>
@@ -3077,7 +3103,7 @@
               <w:rPr>
                 <w:sz w:val="19"/>
               </w:rPr>
-              <w:t>1.630 m / 6,5 dk</w:t>
+              <w:t>1.539 m / 6,2 dk</w:t>
             </w:r>
           </w:p>
         </w:tc>
@@ -3091,7 +3117,7 @@
               <w:rPr>
                 <w:sz w:val="19"/>
               </w:rPr>
-              <w:t>2.081 m / 8,3 dk</w:t>
+              <w:t>2.014 m / 8,1 dk</w:t>
             </w:r>
           </w:p>
         </w:tc>
@@ -3105,7 +3131,7 @@
               <w:rPr>
                 <w:sz w:val="19"/>
               </w:rPr>
-              <w:t>+451 m / +1,8 dk</w:t>
+              <w:t>+475 m / +1,9 dk</w:t>
             </w:r>
           </w:p>
         </w:tc>
@@ -3220,7 +3246,7 @@
               <w:rPr>
                 <w:sz w:val="19"/>
               </w:rPr>
-              <w:t>6,8 dk</w:t>
+              <w:t>32,8 dk</w:t>
             </w:r>
           </w:p>
         </w:tc>
@@ -3280,7 +3306,7 @@
           <w:b w:val="0"/>
           <w:sz w:val="21"/>
         </w:rPr>
-        <w:t>On atamanın birinde (Kahramanmaraş, rich-ekip-2 → rich-ihbar-1) naif ajan hedefe hiçbir zaman ulaşamadı — rastgele kapatılan yolların oluşturduğu yerel labirentte, bilmeden ilerleyip geri dönme döngüsüne girip çözülemeyen bir noktada kaldı (naiveUnreachable: true). Bu tek vakada bile sonuç nettir: sistem olmasaydı bu ekip hedefine hiç ulaşamayacaktı.</w:t>
+        <w:t>On atamanın ikisinde (Kahramanmaraş; rich-ekip-1 → rich-ihbar-2 ve rich-ekip-5 → rich-ihbar-5) naif ajan hedefe hiçbir zaman ulaşamadı — rastgele kapatılan yolların oluşturduğu yerel labirentte, bilmeden ilerleyip geri dönme döngüsüne girip çözülemeyen bir noktada kaldı (naiveUnreachable: true). Bu iki vakada sonuç nettir: sistem olmasaydı bu ekipler hedeflerine hiç ulaşamayacaktı — üstelik biri "kritik" durumdaki bir enkaz çağrısıydı ve bizim motor oraya 5,4 dakikada bir rota buldu.</w:t>
       </w:r>
     </w:p>
     <w:p>
@@ -3292,7 +3318,7 @@
           <w:b w:val="0"/>
           <w:sz w:val="21"/>
         </w:rPr>
-        <w:t>Kalan dokuz vakanın tamamında naif ajan hedefe ulaştı, ve hiçbirinde bizim motorumuzdan daha kötü değildi — üç vakada (yolun kapanma hiç etkilemediği durumlarda) iki motor birebir aynı mesafeyi buldu, altı vakada bizim motor ölçülebilir şekilde daha kısa bir rota sundu. Bu altı vakadaki toplam kazanç 7,6 dakika ve ~1.903 metre; en büyük tekil kazanç Hatay'da bir ekip için +3,3 dakika / +816 metre oldu.</w:t>
+        <w:t>Kalan sekiz vakanın tamamında naif ajan hedefe ulaştı, ve hiçbirinde bizim motorumuzdan daha kötü değildi — iki vakada (kapanmanın rotayı hiç etkilemediği durumlarda) iki motor birebir aynı mesafeyi buldu, altı vakada bizim motor ölçülebilir şekilde daha kısa bir rota sundu. Bu altı vakadaki toplam kazanç 39,7 dakika ve ~9.891 metre; en büyük tekil kazanç Hatay'da rich-ekip-3 için +21,9 dakika / +5.468 metre oldu — naif ajan 9,1 km yol kat ederken bizim motor aynı hedefe 3,7 km'de vardı.</w:t>
       </w:r>
     </w:p>
     <w:p>
@@ -3305,7 +3331,20 @@
           <w:color w:val="6D6153"/>
           <w:sz w:val="21"/>
         </w:rPr>
-        <w:t>Naif ajanın kaç kez "keşif" yaptığı da (naiveDiscoveries) kayıtlıdır — kazançlı altı vakada 1 ile 3 arasında değişen sayıda yanlış yola girip geri dönmüştür; bu, sahadaki gerçek zaman kaybının (her keşif = bir U dönüşü + yeniden yönlenme) bir başka boyutunu gösterir. Sonuçların üç vakada birebir eşit çıkması da ayrıca önemlidir: bu, karşılaştırmanın rastgele gürültüden değil gerçek bir farktan (kapanmanın rotayı fiilen etkileyip etkilemediğinden) kaynaklandığını doğrular.</w:t>
+        <w:t>Naif ajanın kaç kez "keşif" yaptığı da (naiveDiscoveries) kayıtlıdır — kazançlı altı vakada 2 ile 13 arasında değişen sayıda yanlış yola girip geri dönmüştür; en pahalı vaka olan Hatay/rich-ekip-3'te 13 ayrı kapalı yola bizzat varıp geri dönmek zorunda kalmıştır. Bu, sahadaki gerçek zaman kaybının (her keşif = bir U dönüşü + yeniden yönlenme) bir başka boyutunu gösterir. Sonuçların iki vakada birebir eşit çıkması da ayrıca önemlidir: bu, karşılaştırmanın rastgele gürültüden değil gerçek bir farktan (kapanmanın rotayı fiilen etkileyip etkilemediğinden) kaynaklandığını doğrular.</w:t>
+      </w:r>
+    </w:p>
+    <w:p>
+      <w:pPr>
+        <w:spacing w:after="160"/>
+      </w:pPr>
+      <w:r>
+        <w:rPr>
+          <w:b w:val="0"/>
+          <w:color w:val="6D6153"/>
+          <w:sz w:val="21"/>
+        </w:rPr>
+        <w:t>Bu koşuda kapanma oranlarının düşük görünmesi (%2,2 ve %1,1) yanıltıcı olmamalıdır: yol ağı artık yaya geçişine açık tüm sokakları içerdiği için payda ~40–50 bin segmente çıkmıştır. Mutlak sayı olarak Kahramanmaraş'ta 1.117, Hatay'da 460 gerçek yol segmenti kapatılmıştır ve bunların ekiplerin gitmesi gereken güzergâhlar üzerindeki etkisi yukarıdaki tablolarda görüldüğü gibi belirleyici olmuştur.</w:t>
       </w:r>
     </w:p>
     <w:p>
@@ -3525,7 +3564,7 @@
           <w:rFonts w:ascii="Consolas" w:hAnsi="Consolas"/>
           <w:sz w:val="19"/>
         </w:rPr>
-        <w:t>benchmark/runs/rich-kahramanmaras-final/events.jsonl, summary.json</w:t>
+        <w:t>benchmark/runs/tam-yol-kontrol/events.jsonl, summary.json</w:t>
       </w:r>
     </w:p>
     <w:p>
@@ -3537,7 +3576,7 @@
           <w:rFonts w:ascii="Consolas" w:hAnsi="Consolas"/>
           <w:sz w:val="19"/>
         </w:rPr>
-        <w:t>benchmark/runs/rich-hatay-final/events.jsonl, summary.json</w:t>
+        <w:t>Yeniden çalıştırma: python benchmark/rich_simulation.py &lt;kahramanmaras|hatay|all&gt; --seed 42</w:t>
       </w:r>
     </w:p>
     <w:p>
@@ -3549,7 +3588,7 @@
           <w:rFonts w:ascii="Consolas" w:hAnsi="Consolas"/>
           <w:sz w:val="19"/>
         </w:rPr>
-        <w:t>Yeniden çalıştırma: python benchmark/rich_simulation.py &lt;kahramanmaras|hatay&gt; --seed 42</w:t>
+        <w:t>Yol grafiği önbelleği: python benchmark/warm_rich_sim_cache.py (yaya+araç ağı)</w:t>
       </w:r>
     </w:p>
     <w:p/>

</xml_diff>